<commit_message>
Updated the new Resume
</commit_message>
<xml_diff>
--- a/public/Bahuleya M Resume.docx
+++ b/public/Bahuleya M Resume.docx
@@ -1,6 +1,6 @@
 
 <file path=word/document.xml><?xml version="1.0" encoding="utf-8"?>
-<w:document xmlns:wpc="http://schemas.microsoft.com/office/word/2010/wordprocessingCanvas" xmlns:cx="http://schemas.microsoft.com/office/drawing/2014/chartex" xmlns:cx1="http://schemas.microsoft.com/office/drawing/2015/9/8/chartex" xmlns:cx2="http://schemas.microsoft.com/office/drawing/2015/10/21/chartex" xmlns:cx3="http://schemas.microsoft.com/office/drawing/2016/5/9/chartex" xmlns:cx4="http://schemas.microsoft.com/office/drawing/2016/5/10/chartex" xmlns:cx5="http://schemas.microsoft.com/office/drawing/2016/5/11/chartex" xmlns:cx6="http://schemas.microsoft.com/office/drawing/2016/5/12/chartex" xmlns:cx7="http://schemas.microsoft.com/office/drawing/2016/5/13/chartex" xmlns:cx8="http://schemas.microsoft.com/office/drawing/2016/5/14/chartex" xmlns:mc="http://schemas.openxmlformats.org/markup-compatibility/2006" xmlns:aink="http://schemas.microsoft.com/office/drawing/2016/ink" xmlns:am3d="http://schemas.microsoft.com/office/drawing/2017/model3d" xmlns:o="urn:schemas-microsoft-com:office:office" xmlns:oel="http://schemas.microsoft.com/office/2019/extlst" xmlns:r="http://schemas.openxmlformats.org/officeDocument/2006/relationships" xmlns:m="http://schemas.openxmlformats.org/officeDocument/2006/math" xmlns:v="urn:schemas-microsoft-com:vml" xmlns:wp14="http://schemas.microsoft.com/office/word/2010/wordprocessingDrawing" xmlns:wp="http://schemas.openxmlformats.org/drawingml/2006/wordprocessingDrawing" xmlns:w10="urn:schemas-microsoft-com:office:word" xmlns:w="http://schemas.openxmlformats.org/wordprocessingml/2006/main" xmlns:w14="http://schemas.microsoft.com/office/word/2010/wordml" xmlns:w15="http://schemas.microsoft.com/office/word/2012/wordml" xmlns:w16cei="http://schemas.microsoft.com/office/word/2026/wordml/cei" xmlns:w16cex="http://schemas.microsoft.com/office/word/2018/wordml/cex" xmlns:w16cid="http://schemas.microsoft.com/office/word/2016/wordml/cid" xmlns:w16="http://schemas.microsoft.com/office/word/2018/wordml" xmlns:w16du="http://schemas.microsoft.com/office/word/2023/wordml/word16du" xmlns:w16sdtdh="http://schemas.microsoft.com/office/word/2020/wordml/sdtdatahash" xmlns:w16sdtfl="http://schemas.microsoft.com/office/word/2024/wordml/sdtformatlock" xmlns:w16se="http://schemas.microsoft.com/office/word/2015/wordml/symex" xmlns:wpg="http://schemas.microsoft.com/office/word/2010/wordprocessingGroup" xmlns:wpi="http://schemas.microsoft.com/office/word/2010/wordprocessingInk" xmlns:wne="http://schemas.microsoft.com/office/word/2006/wordml" xmlns:wps="http://schemas.microsoft.com/office/word/2010/wordprocessingShape" mc:Ignorable="w14 w15 w16se w16cid w16 w16cex w16sdtdh w16sdtfl w16du wp14">
+<w:document xmlns:wpc="http://schemas.microsoft.com/office/word/2010/wordprocessingCanvas" xmlns:cx="http://schemas.microsoft.com/office/drawing/2014/chartex" xmlns:cx1="http://schemas.microsoft.com/office/drawing/2015/9/8/chartex" xmlns:cx2="http://schemas.microsoft.com/office/drawing/2015/10/21/chartex" xmlns:cx3="http://schemas.microsoft.com/office/drawing/2016/5/9/chartex" xmlns:cx4="http://schemas.microsoft.com/office/drawing/2016/5/10/chartex" xmlns:cx5="http://schemas.microsoft.com/office/drawing/2016/5/11/chartex" xmlns:cx6="http://schemas.microsoft.com/office/drawing/2016/5/12/chartex" xmlns:cx7="http://schemas.microsoft.com/office/drawing/2016/5/13/chartex" xmlns:cx8="http://schemas.microsoft.com/office/drawing/2016/5/14/chartex" xmlns:mc="http://schemas.openxmlformats.org/markup-compatibility/2006" xmlns:aink="http://schemas.microsoft.com/office/drawing/2016/ink" xmlns:am3d="http://schemas.microsoft.com/office/drawing/2017/model3d" xmlns:o="urn:schemas-microsoft-com:office:office" xmlns:oel="http://schemas.microsoft.com/office/2019/extlst" xmlns:r="http://schemas.openxmlformats.org/officeDocument/2006/relationships" xmlns:m="http://schemas.openxmlformats.org/officeDocument/2006/math" xmlns:v="urn:schemas-microsoft-com:vml" xmlns:wp14="http://schemas.microsoft.com/office/word/2010/wordprocessingDrawing" xmlns:wp="http://schemas.openxmlformats.org/drawingml/2006/wordprocessingDrawing" xmlns:w10="urn:schemas-microsoft-com:office:word" xmlns:w="http://schemas.openxmlformats.org/wordprocessingml/2006/main" xmlns:w14="http://schemas.microsoft.com/office/word/2010/wordml" xmlns:w15="http://schemas.microsoft.com/office/word/2012/wordml" xmlns:w16cex="http://schemas.microsoft.com/office/word/2018/wordml/cex" xmlns:w16cid="http://schemas.microsoft.com/office/word/2016/wordml/cid" xmlns:w16="http://schemas.microsoft.com/office/word/2018/wordml" xmlns:w16du="http://schemas.microsoft.com/office/word/2023/wordml/word16du" xmlns:w16sdtdh="http://schemas.microsoft.com/office/word/2020/wordml/sdtdatahash" xmlns:w16sdtfl="http://schemas.microsoft.com/office/word/2024/wordml/sdtformatlock" xmlns:w16se="http://schemas.microsoft.com/office/word/2015/wordml/symex" xmlns:wpg="http://schemas.microsoft.com/office/word/2010/wordprocessingGroup" xmlns:wpi="http://schemas.microsoft.com/office/word/2010/wordprocessingInk" xmlns:wne="http://schemas.microsoft.com/office/word/2006/wordml" xmlns:wps="http://schemas.microsoft.com/office/word/2010/wordprocessingShape" mc:Ignorable="w14 w15 w16se w16cid w16 w16cex w16sdtdh w16sdtfl w16du wp14">
   <w:body>
     <w:p>
       <w:pPr>
@@ -118,7 +118,7 @@
     <w:p>
       <w:pPr>
         <w:tabs>
-          <w:tab w:val="right" w:pos="9360"/>
+          <w:tab w:val="right" w:pos="10065"/>
         </w:tabs>
         <w:spacing w:before="120" w:after="40"/>
       </w:pPr>
@@ -167,7 +167,19 @@
         <w:rPr>
           <w:color w:val="1A1A1A"/>
         </w:rPr>
-        <w:t>Relevant coursework: Computational Methods, Computer Networks, Data Structures and Algorithms, Artificial Intelligence, Neural Networks, Data Analytics</w:t>
+        <w:t xml:space="preserve">Relevant coursework: Computational Methods, Computer Networks, Data Structures and Algorithms, Artificial Intelligence, </w:t>
+      </w:r>
+      <w:r>
+        <w:rPr>
+          <w:color w:val="1A1A1A"/>
+        </w:rPr>
+        <w:t xml:space="preserve">MLOps, DevOps, </w:t>
+      </w:r>
+      <w:r>
+        <w:rPr>
+          <w:color w:val="1A1A1A"/>
+        </w:rPr>
+        <w:t>Neural Networks, Data Analytics</w:t>
       </w:r>
     </w:p>
     <w:p>
@@ -185,13 +197,13 @@
           <w:sz w:val="24"/>
           <w:szCs w:val="24"/>
         </w:rPr>
-        <w:t>RESEARCH EXPERIENCE</w:t>
+        <w:t>EXPERIENCE</w:t>
       </w:r>
     </w:p>
     <w:p>
       <w:pPr>
         <w:tabs>
-          <w:tab w:val="right" w:pos="9360"/>
+          <w:tab w:val="right" w:pos="10065"/>
         </w:tabs>
         <w:spacing w:before="120" w:after="40"/>
       </w:pPr>
@@ -350,6 +362,183 @@
         </w:rPr>
         <w:t>Participated in interdisciplinary innovation challenges focused on scalable human-centered technology and healthcare applications</w:t>
       </w:r>
+    </w:p>
+    <w:p>
+      <w:pPr>
+        <w:tabs>
+          <w:tab w:val="right" w:pos="10065"/>
+        </w:tabs>
+        <w:spacing w:before="120" w:after="40"/>
+        <w:rPr>
+          <w:i/>
+          <w:iCs/>
+          <w:color w:val="555555"/>
+        </w:rPr>
+      </w:pPr>
+      <w:r>
+        <w:rPr>
+          <w:b/>
+          <w:bCs/>
+          <w:color w:val="1A1A1A"/>
+          <w:sz w:val="22"/>
+          <w:szCs w:val="22"/>
+        </w:rPr>
+        <w:t xml:space="preserve">Software Associate Intern </w:t>
+      </w:r>
+      <w:r>
+        <w:rPr>
+          <w:b/>
+          <w:bCs/>
+          <w:color w:val="1A1A1A"/>
+          <w:sz w:val="22"/>
+          <w:szCs w:val="22"/>
+        </w:rPr>
+        <w:t xml:space="preserve"> </w:t>
+      </w:r>
+      <w:r>
+        <w:rPr>
+          <w:color w:val="555555"/>
+        </w:rPr>
+        <w:t xml:space="preserve">|  </w:t>
+      </w:r>
+      <w:r>
+        <w:rPr>
+          <w:color w:val="555555"/>
+        </w:rPr>
+        <w:t xml:space="preserve">Virtuonix </w:t>
+      </w:r>
+      <w:r>
+        <w:rPr>
+          <w:i/>
+          <w:iCs/>
+          <w:color w:val="555555"/>
+        </w:rPr>
+        <w:t xml:space="preserve">            </w:t>
+      </w:r>
+      <w:r>
+        <w:rPr>
+          <w:i/>
+          <w:iCs/>
+          <w:color w:val="555555"/>
+        </w:rPr>
+        <w:tab/>
+        <w:t>Aug</w:t>
+      </w:r>
+      <w:r>
+        <w:rPr>
+          <w:i/>
+          <w:iCs/>
+          <w:color w:val="555555"/>
+        </w:rPr>
+        <w:t xml:space="preserve"> 202</w:t>
+      </w:r>
+      <w:r>
+        <w:rPr>
+          <w:i/>
+          <w:iCs/>
+          <w:color w:val="555555"/>
+        </w:rPr>
+        <w:t>6</w:t>
+      </w:r>
+      <w:r>
+        <w:rPr>
+          <w:i/>
+          <w:iCs/>
+          <w:color w:val="555555"/>
+        </w:rPr>
+        <w:t xml:space="preserve"> – </w:t>
+      </w:r>
+      <w:r>
+        <w:rPr>
+          <w:i/>
+          <w:iCs/>
+          <w:color w:val="555555"/>
+        </w:rPr>
+        <w:t>Sep 2026</w:t>
+      </w:r>
+    </w:p>
+    <w:p>
+      <w:pPr>
+        <w:numPr>
+          <w:ilvl w:val="0"/>
+          <w:numId w:val="1"/>
+        </w:numPr>
+        <w:pBdr>
+          <w:top w:val="nil"/>
+          <w:left w:val="nil"/>
+          <w:bottom w:val="nil"/>
+          <w:right w:val="nil"/>
+          <w:between w:val="nil"/>
+        </w:pBdr>
+        <w:spacing w:after="40"/>
+      </w:pPr>
+      <w:r>
+        <w:rPr>
+          <w:color w:val="1A1A1A"/>
+        </w:rPr>
+        <w:t>Researched and evaluated XR, AI/ML, computer vision, and simulation technologies for industrial applications, with emphasis on feasibility, performance, and integration.</w:t>
+      </w:r>
+    </w:p>
+    <w:p>
+      <w:pPr>
+        <w:numPr>
+          <w:ilvl w:val="0"/>
+          <w:numId w:val="1"/>
+        </w:numPr>
+        <w:pBdr>
+          <w:top w:val="nil"/>
+          <w:left w:val="nil"/>
+          <w:bottom w:val="nil"/>
+          <w:right w:val="nil"/>
+          <w:between w:val="nil"/>
+        </w:pBdr>
+        <w:spacing w:after="40"/>
+      </w:pPr>
+      <w:r>
+        <w:rPr>
+          <w:color w:val="1A1A1A"/>
+        </w:rPr>
+        <w:t>Conducted functional, exploratory, and scenario-based testing of VR/AR systems, documenting defects, inconsistencies, and performance issues across software and hardware components.</w:t>
+      </w:r>
+    </w:p>
+    <w:p>
+      <w:pPr>
+        <w:numPr>
+          <w:ilvl w:val="0"/>
+          <w:numId w:val="1"/>
+        </w:numPr>
+        <w:pBdr>
+          <w:top w:val="nil"/>
+          <w:left w:val="nil"/>
+          <w:bottom w:val="nil"/>
+          <w:right w:val="nil"/>
+          <w:between w:val="nil"/>
+        </w:pBdr>
+        <w:spacing w:after="40"/>
+      </w:pPr>
+      <w:r>
+        <w:t>Evaluated AI-assisted workflows and intelligent interaction mechanisms for industrial training and field-support applications.</w:t>
+      </w:r>
+    </w:p>
+    <w:p>
+      <w:pPr>
+        <w:tabs>
+          <w:tab w:val="right" w:pos="10065"/>
+        </w:tabs>
+        <w:spacing w:before="120" w:after="40"/>
+      </w:pPr>
+    </w:p>
+    <w:p>
+      <w:pPr>
+        <w:pBdr>
+          <w:top w:val="nil"/>
+          <w:left w:val="nil"/>
+          <w:bottom w:val="nil"/>
+          <w:right w:val="nil"/>
+          <w:between w:val="nil"/>
+        </w:pBdr>
+        <w:spacing w:after="40"/>
+      </w:pPr>
     </w:p>
     <w:p>
       <w:pPr>
@@ -375,6 +564,7 @@
           <w:tab w:val="right" w:pos="9360"/>
         </w:tabs>
         <w:spacing w:before="120" w:after="40"/>
+        <w:ind w:left="284"/>
       </w:pPr>
       <w:r>
         <w:rPr>
@@ -531,6 +721,7 @@
           <w:tab w:val="right" w:pos="9360"/>
         </w:tabs>
         <w:spacing w:before="120" w:after="40"/>
+        <w:ind w:left="284"/>
       </w:pPr>
       <w:r>
         <w:rPr>
@@ -614,6 +805,7 @@
           <w:tab w:val="right" w:pos="9360"/>
         </w:tabs>
         <w:spacing w:before="120" w:after="40"/>
+        <w:ind w:left="284"/>
       </w:pPr>
       <w:r>
         <w:rPr>
@@ -712,6 +904,7 @@
         <w:rPr>
           <w:color w:val="1A1A1A"/>
         </w:rPr>
+        <w:lastRenderedPageBreak/>
         <w:t>Tech: React/Node dashboard for real-time monitoring; prototype stage with proof-of-concept validated</w:t>
       </w:r>
     </w:p>
@@ -743,6 +936,7 @@
           <w:tab w:val="right" w:pos="9360"/>
         </w:tabs>
         <w:spacing w:before="120" w:after="40"/>
+        <w:ind w:left="284"/>
       </w:pPr>
       <w:r>
         <w:rPr>
@@ -873,6 +1067,7 @@
           <w:tab w:val="right" w:pos="9360"/>
         </w:tabs>
         <w:spacing w:before="120" w:after="40"/>
+        <w:ind w:left="284"/>
         <w:rPr>
           <w:i/>
           <w:iCs/>
@@ -887,7 +1082,6 @@
           <w:sz w:val="22"/>
           <w:szCs w:val="22"/>
         </w:rPr>
-        <w:lastRenderedPageBreak/>
         <w:t xml:space="preserve">EcoTracker – Personal Carbon Footprint Tracker </w:t>
       </w:r>
       <w:r>
@@ -984,6 +1178,7 @@
           <w:tab w:val="right" w:pos="9360"/>
         </w:tabs>
         <w:spacing w:before="120" w:after="40"/>
+        <w:ind w:left="284"/>
         <w:rPr>
           <w:i/>
           <w:iCs/>
@@ -1072,6 +1267,7 @@
           <w:tab w:val="right" w:pos="9360"/>
         </w:tabs>
         <w:spacing w:before="120" w:after="40"/>
+        <w:ind w:left="284"/>
         <w:rPr>
           <w:i/>
           <w:iCs/>
@@ -1174,7 +1370,7 @@
     <w:p>
       <w:pPr>
         <w:tabs>
-          <w:tab w:val="right" w:pos="9360"/>
+          <w:tab w:val="right" w:pos="10065"/>
         </w:tabs>
         <w:spacing w:before="120" w:after="40"/>
         <w:rPr>
@@ -1403,6 +1599,7 @@
           <w:between w:val="nil"/>
         </w:pBdr>
         <w:spacing w:after="40"/>
+        <w:ind w:left="284"/>
       </w:pPr>
       <w:r>
         <w:rPr>
@@ -1425,6 +1622,7 @@
           <w:between w:val="nil"/>
         </w:pBdr>
         <w:spacing w:after="40"/>
+        <w:ind w:left="284"/>
       </w:pPr>
       <w:r>
         <w:rPr>
@@ -1447,12 +1645,25 @@
           <w:between w:val="nil"/>
         </w:pBdr>
         <w:spacing w:after="40"/>
-      </w:pPr>
-      <w:r>
-        <w:rPr>
-          <w:color w:val="1A1A1A"/>
-        </w:rPr>
-        <w:t>NTPEL – Applied Accelerated Artificial Intelligence</w:t>
+        <w:ind w:left="284"/>
+      </w:pPr>
+      <w:r>
+        <w:rPr>
+          <w:color w:val="1A1A1A"/>
+        </w:rPr>
+        <w:t>NP</w:t>
+      </w:r>
+      <w:r>
+        <w:rPr>
+          <w:color w:val="1A1A1A"/>
+        </w:rPr>
+        <w:t>T</w:t>
+      </w:r>
+      <w:r>
+        <w:rPr>
+          <w:color w:val="1A1A1A"/>
+        </w:rPr>
+        <w:t>EL – Applied Accelerated Artificial Intelligence</w:t>
       </w:r>
     </w:p>
     <w:p>
@@ -1469,12 +1680,25 @@
           <w:between w:val="nil"/>
         </w:pBdr>
         <w:spacing w:after="40"/>
-      </w:pPr>
-      <w:r>
-        <w:rPr>
-          <w:color w:val="1A1A1A"/>
-        </w:rPr>
-        <w:t>NTPEL – Artificial Intelligence: Search Methods for Problem Solving</w:t>
+        <w:ind w:left="284"/>
+      </w:pPr>
+      <w:r>
+        <w:rPr>
+          <w:color w:val="1A1A1A"/>
+        </w:rPr>
+        <w:t>NP</w:t>
+      </w:r>
+      <w:r>
+        <w:rPr>
+          <w:color w:val="1A1A1A"/>
+        </w:rPr>
+        <w:t>T</w:t>
+      </w:r>
+      <w:r>
+        <w:rPr>
+          <w:color w:val="1A1A1A"/>
+        </w:rPr>
+        <w:t>EL – Artificial Intelligence: Search Methods for Problem Solving</w:t>
       </w:r>
     </w:p>
     <w:p>
@@ -1491,6 +1715,7 @@
           <w:between w:val="nil"/>
         </w:pBdr>
         <w:spacing w:after="40"/>
+        <w:ind w:left="284"/>
       </w:pPr>
       <w:r>
         <w:rPr>
@@ -1513,6 +1738,7 @@
           <w:between w:val="nil"/>
         </w:pBdr>
         <w:spacing w:after="40"/>
+        <w:ind w:left="284"/>
       </w:pPr>
       <w:r>
         <w:rPr>
@@ -1535,6 +1761,7 @@
           <w:between w:val="nil"/>
         </w:pBdr>
         <w:spacing w:after="40"/>
+        <w:ind w:left="284"/>
       </w:pPr>
       <w:r>
         <w:rPr>
@@ -1557,6 +1784,7 @@
           <w:between w:val="nil"/>
         </w:pBdr>
         <w:spacing w:after="40"/>
+        <w:ind w:left="284"/>
       </w:pPr>
       <w:r>
         <w:rPr>
@@ -1579,6 +1807,7 @@
           <w:between w:val="nil"/>
         </w:pBdr>
         <w:spacing w:after="40"/>
+        <w:ind w:left="284"/>
       </w:pPr>
       <w:r>
         <w:rPr>
@@ -1601,6 +1830,7 @@
           <w:between w:val="nil"/>
         </w:pBdr>
         <w:spacing w:after="40"/>
+        <w:ind w:left="284"/>
       </w:pPr>
       <w:r>
         <w:rPr>
@@ -1625,7 +1855,7 @@
 </file>
 
 <file path=word/numbering.xml><?xml version="1.0" encoding="utf-8"?>
-<w:numbering xmlns:wpc="http://schemas.microsoft.com/office/word/2010/wordprocessingCanvas" xmlns:cx="http://schemas.microsoft.com/office/drawing/2014/chartex" xmlns:cx1="http://schemas.microsoft.com/office/drawing/2015/9/8/chartex" xmlns:cx2="http://schemas.microsoft.com/office/drawing/2015/10/21/chartex" xmlns:cx3="http://schemas.microsoft.com/office/drawing/2016/5/9/chartex" xmlns:cx4="http://schemas.microsoft.com/office/drawing/2016/5/10/chartex" xmlns:cx5="http://schemas.microsoft.com/office/drawing/2016/5/11/chartex" xmlns:cx6="http://schemas.microsoft.com/office/drawing/2016/5/12/chartex" xmlns:cx7="http://schemas.microsoft.com/office/drawing/2016/5/13/chartex" xmlns:cx8="http://schemas.microsoft.com/office/drawing/2016/5/14/chartex" xmlns:mc="http://schemas.openxmlformats.org/markup-compatibility/2006" xmlns:aink="http://schemas.microsoft.com/office/drawing/2016/ink" xmlns:am3d="http://schemas.microsoft.com/office/drawing/2017/model3d" xmlns:o="urn:schemas-microsoft-com:office:office" xmlns:oel="http://schemas.microsoft.com/office/2019/extlst" xmlns:r="http://schemas.openxmlformats.org/officeDocument/2006/relationships" xmlns:m="http://schemas.openxmlformats.org/officeDocument/2006/math" xmlns:v="urn:schemas-microsoft-com:vml" xmlns:wp14="http://schemas.microsoft.com/office/word/2010/wordprocessingDrawing" xmlns:wp="http://schemas.openxmlformats.org/drawingml/2006/wordprocessingDrawing" xmlns:w10="urn:schemas-microsoft-com:office:word" xmlns:w="http://schemas.openxmlformats.org/wordprocessingml/2006/main" xmlns:w14="http://schemas.microsoft.com/office/word/2010/wordml" xmlns:w15="http://schemas.microsoft.com/office/word/2012/wordml" xmlns:w16cei="http://schemas.microsoft.com/office/word/2026/wordml/cei" xmlns:w16cex="http://schemas.microsoft.com/office/word/2018/wordml/cex" xmlns:w16cid="http://schemas.microsoft.com/office/word/2016/wordml/cid" xmlns:w16="http://schemas.microsoft.com/office/word/2018/wordml" xmlns:w16du="http://schemas.microsoft.com/office/word/2023/wordml/word16du" xmlns:w16sdtdh="http://schemas.microsoft.com/office/word/2020/wordml/sdtdatahash" xmlns:w16sdtfl="http://schemas.microsoft.com/office/word/2024/wordml/sdtformatlock" xmlns:w16se="http://schemas.microsoft.com/office/word/2015/wordml/symex" xmlns:wpg="http://schemas.microsoft.com/office/word/2010/wordprocessingGroup" xmlns:wpi="http://schemas.microsoft.com/office/word/2010/wordprocessingInk" xmlns:wne="http://schemas.microsoft.com/office/word/2006/wordml" xmlns:wps="http://schemas.microsoft.com/office/word/2010/wordprocessingShape" mc:Ignorable="w14 w15 w16se w16cid w16 w16cex w16sdtdh w16sdtfl w16du wp14">
+<w:numbering xmlns:wpc="http://schemas.microsoft.com/office/word/2010/wordprocessingCanvas" xmlns:cx="http://schemas.microsoft.com/office/drawing/2014/chartex" xmlns:cx1="http://schemas.microsoft.com/office/drawing/2015/9/8/chartex" xmlns:cx2="http://schemas.microsoft.com/office/drawing/2015/10/21/chartex" xmlns:cx3="http://schemas.microsoft.com/office/drawing/2016/5/9/chartex" xmlns:cx4="http://schemas.microsoft.com/office/drawing/2016/5/10/chartex" xmlns:cx5="http://schemas.microsoft.com/office/drawing/2016/5/11/chartex" xmlns:cx6="http://schemas.microsoft.com/office/drawing/2016/5/12/chartex" xmlns:cx7="http://schemas.microsoft.com/office/drawing/2016/5/13/chartex" xmlns:cx8="http://schemas.microsoft.com/office/drawing/2016/5/14/chartex" xmlns:mc="http://schemas.openxmlformats.org/markup-compatibility/2006" xmlns:aink="http://schemas.microsoft.com/office/drawing/2016/ink" xmlns:am3d="http://schemas.microsoft.com/office/drawing/2017/model3d" xmlns:o="urn:schemas-microsoft-com:office:office" xmlns:oel="http://schemas.microsoft.com/office/2019/extlst" xmlns:r="http://schemas.openxmlformats.org/officeDocument/2006/relationships" xmlns:m="http://schemas.openxmlformats.org/officeDocument/2006/math" xmlns:v="urn:schemas-microsoft-com:vml" xmlns:wp14="http://schemas.microsoft.com/office/word/2010/wordprocessingDrawing" xmlns:wp="http://schemas.openxmlformats.org/drawingml/2006/wordprocessingDrawing" xmlns:w10="urn:schemas-microsoft-com:office:word" xmlns:w="http://schemas.openxmlformats.org/wordprocessingml/2006/main" xmlns:w14="http://schemas.microsoft.com/office/word/2010/wordml" xmlns:w15="http://schemas.microsoft.com/office/word/2012/wordml" xmlns:w16cex="http://schemas.microsoft.com/office/word/2018/wordml/cex" xmlns:w16cid="http://schemas.microsoft.com/office/word/2016/wordml/cid" xmlns:w16="http://schemas.microsoft.com/office/word/2018/wordml" xmlns:w16du="http://schemas.microsoft.com/office/word/2023/wordml/word16du" xmlns:w16sdtdh="http://schemas.microsoft.com/office/word/2020/wordml/sdtdatahash" xmlns:w16sdtfl="http://schemas.microsoft.com/office/word/2024/wordml/sdtformatlock" xmlns:w16se="http://schemas.microsoft.com/office/word/2015/wordml/symex" xmlns:wpg="http://schemas.microsoft.com/office/word/2010/wordprocessingGroup" xmlns:wpi="http://schemas.microsoft.com/office/word/2010/wordprocessingInk" xmlns:wne="http://schemas.microsoft.com/office/word/2006/wordml" xmlns:wps="http://schemas.microsoft.com/office/word/2010/wordprocessingShape" mc:Ignorable="w14 w15 w16se w16cid w16 w16cex w16sdtdh w16sdtfl w16du wp14">
   <w:abstractNum w:abstractNumId="0" w15:restartNumberingAfterBreak="0">
     <w:nsid w:val="005F740F"/>
     <w:multiLevelType w:val="multilevel"/>

</xml_diff>

<commit_message>
Update project naming and remove codebase links
</commit_message>
<xml_diff>
--- a/public/Bahuleya M Resume.docx
+++ b/public/Bahuleya M Resume.docx
@@ -74,6 +74,7 @@
           <w:bottom w:val="single" w:sz="8" w:space="2" w:color="1A4F8A"/>
         </w:pBdr>
         <w:spacing w:before="180" w:after="60"/>
+        <w:jc w:val="both"/>
       </w:pPr>
       <w:r>
         <w:rPr>
@@ -89,12 +90,31 @@
     <w:p>
       <w:pPr>
         <w:spacing w:after="60"/>
-      </w:pPr>
-      <w:r>
-        <w:rPr>
-          <w:color w:val="1A1A1A"/>
-        </w:rPr>
-        <w:t>Second-year Computer Science (AI &amp; ML) undergraduate with hands-on experience in AI-driven product development, full-stack technologies, embedded systems, neural networks, language processing and applied machine learning. Passionate about building impactful real-world solutions across healthcare, sustainability, and assistive technology, with a focus on intelligent systems, computer vision, and scalable innovation for emerging societal challenges.</w:t>
+        <w:jc w:val="both"/>
+      </w:pPr>
+      <w:r>
+        <w:rPr>
+          <w:color w:val="1A1A1A"/>
+        </w:rPr>
+        <w:t>Third</w:t>
+      </w:r>
+      <w:r>
+        <w:rPr>
+          <w:color w:val="1A1A1A"/>
+        </w:rPr>
+        <w:t xml:space="preserve">-year Computer Science (AI &amp; ML) undergraduate with hands-on experience in AI-driven product development, full-stack technologies, embedded systems, neural networks, language processing and applied machine learning. </w:t>
+      </w:r>
+      <w:r>
+        <w:rPr>
+          <w:color w:val="1A1A1A"/>
+        </w:rPr>
+        <w:t>Focused on b</w:t>
+      </w:r>
+      <w:r>
+        <w:rPr>
+          <w:color w:val="1A1A1A"/>
+        </w:rPr>
+        <w:t>uilding impactful real-world solutions across healthcare, sustainability, and assistive technology, with a focus on intelligent systems, computer vision, and scalable innovation for emerging societal challenges.</w:t>
       </w:r>
     </w:p>
     <w:p>
@@ -103,6 +123,7 @@
           <w:bottom w:val="single" w:sz="8" w:space="2" w:color="1A4F8A"/>
         </w:pBdr>
         <w:spacing w:before="180" w:after="60"/>
+        <w:jc w:val="both"/>
       </w:pPr>
       <w:r>
         <w:rPr>
@@ -121,6 +142,7 @@
           <w:tab w:val="right" w:pos="10065"/>
         </w:tabs>
         <w:spacing w:before="120" w:after="40"/>
+        <w:jc w:val="both"/>
       </w:pPr>
       <w:r>
         <w:rPr>
@@ -162,6 +184,7 @@
           <w:between w:val="nil"/>
         </w:pBdr>
         <w:spacing w:after="40"/>
+        <w:jc w:val="both"/>
       </w:pPr>
       <w:r>
         <w:rPr>
@@ -188,6 +211,7 @@
           <w:bottom w:val="single" w:sz="8" w:space="2" w:color="1A4F8A"/>
         </w:pBdr>
         <w:spacing w:before="180" w:after="60"/>
+        <w:jc w:val="both"/>
       </w:pPr>
       <w:r>
         <w:rPr>
@@ -206,6 +230,7 @@
           <w:tab w:val="right" w:pos="10065"/>
         </w:tabs>
         <w:spacing w:before="120" w:after="40"/>
+        <w:jc w:val="both"/>
       </w:pPr>
       <w:r>
         <w:rPr>
@@ -230,7 +255,23 @@
           <w:color w:val="555555"/>
         </w:rPr>
         <w:tab/>
-        <w:t xml:space="preserve">            Sep 2025 – Present</w:t>
+        <w:t xml:space="preserve">            Sep 2025 </w:t>
+      </w:r>
+      <w:r>
+        <w:rPr>
+          <w:i/>
+          <w:iCs/>
+          <w:color w:val="555555"/>
+        </w:rPr>
+        <w:t>-</w:t>
+      </w:r>
+      <w:r>
+        <w:rPr>
+          <w:i/>
+          <w:iCs/>
+          <w:color w:val="555555"/>
+        </w:rPr>
+        <w:t xml:space="preserve"> Present</w:t>
       </w:r>
     </w:p>
     <w:p>
@@ -247,6 +288,7 @@
           <w:between w:val="nil"/>
         </w:pBdr>
         <w:spacing w:after="40"/>
+        <w:jc w:val="both"/>
       </w:pPr>
       <w:r>
         <w:rPr>
@@ -269,12 +311,19 @@
           <w:between w:val="nil"/>
         </w:pBdr>
         <w:spacing w:after="40"/>
-      </w:pPr>
-      <w:r>
-        <w:rPr>
-          <w:color w:val="1A1A1A"/>
-        </w:rPr>
-        <w:t>Mastered end-to-end ML pipelines: data collection</w:t>
+        <w:jc w:val="both"/>
+      </w:pPr>
+      <w:r>
+        <w:rPr>
+          <w:color w:val="1A1A1A"/>
+        </w:rPr>
+        <w:t xml:space="preserve">Built </w:t>
+      </w:r>
+      <w:r>
+        <w:rPr>
+          <w:color w:val="1A1A1A"/>
+        </w:rPr>
+        <w:t>end-to-end ML pipelines: data collection</w:t>
       </w:r>
       <w:r>
         <w:rPr>
@@ -333,6 +382,7 @@
           <w:between w:val="nil"/>
         </w:pBdr>
         <w:spacing w:after="40"/>
+        <w:jc w:val="both"/>
       </w:pPr>
       <w:r>
         <w:rPr>
@@ -355,6 +405,7 @@
           <w:between w:val="nil"/>
         </w:pBdr>
         <w:spacing w:after="40"/>
+        <w:jc w:val="both"/>
       </w:pPr>
       <w:r>
         <w:rPr>
@@ -369,6 +420,7 @@
           <w:tab w:val="right" w:pos="10065"/>
         </w:tabs>
         <w:spacing w:before="120" w:after="40"/>
+        <w:jc w:val="both"/>
         <w:rPr>
           <w:i/>
           <w:iCs/>
@@ -383,29 +435,13 @@
           <w:sz w:val="22"/>
           <w:szCs w:val="22"/>
         </w:rPr>
-        <w:t xml:space="preserve">Software Associate Intern </w:t>
-      </w:r>
-      <w:r>
-        <w:rPr>
-          <w:b/>
-          <w:bCs/>
-          <w:color w:val="1A1A1A"/>
-          <w:sz w:val="22"/>
-          <w:szCs w:val="22"/>
-        </w:rPr>
-        <w:t xml:space="preserve"> </w:t>
-      </w:r>
-      <w:r>
-        <w:rPr>
-          <w:color w:val="555555"/>
-        </w:rPr>
-        <w:t xml:space="preserve">|  </w:t>
-      </w:r>
-      <w:r>
-        <w:rPr>
-          <w:color w:val="555555"/>
-        </w:rPr>
-        <w:t xml:space="preserve">Virtuonix </w:t>
+        <w:t xml:space="preserve">Software Associate Intern  </w:t>
+      </w:r>
+      <w:r>
+        <w:rPr>
+          <w:color w:val="555555"/>
+        </w:rPr>
+        <w:t xml:space="preserve">|  Virtuonix </w:t>
       </w:r>
       <w:r>
         <w:rPr>
@@ -422,7 +458,7 @@
           <w:color w:val="555555"/>
         </w:rPr>
         <w:tab/>
-        <w:t>Aug</w:t>
+        <w:t>Aug 2026</w:t>
       </w:r>
       <w:r>
         <w:rPr>
@@ -430,7 +466,7 @@
           <w:iCs/>
           <w:color w:val="555555"/>
         </w:rPr>
-        <w:t xml:space="preserve"> 202</w:t>
+        <w:t xml:space="preserve"> -</w:t>
       </w:r>
       <w:r>
         <w:rPr>
@@ -438,23 +474,7 @@
           <w:iCs/>
           <w:color w:val="555555"/>
         </w:rPr>
-        <w:t>6</w:t>
-      </w:r>
-      <w:r>
-        <w:rPr>
-          <w:i/>
-          <w:iCs/>
-          <w:color w:val="555555"/>
-        </w:rPr>
-        <w:t xml:space="preserve"> – </w:t>
-      </w:r>
-      <w:r>
-        <w:rPr>
-          <w:i/>
-          <w:iCs/>
-          <w:color w:val="555555"/>
-        </w:rPr>
-        <w:t>Sep 2026</w:t>
+        <w:t xml:space="preserve"> Sep 2026</w:t>
       </w:r>
     </w:p>
     <w:p>
@@ -471,6 +491,7 @@
           <w:between w:val="nil"/>
         </w:pBdr>
         <w:spacing w:after="40"/>
+        <w:jc w:val="both"/>
       </w:pPr>
       <w:r>
         <w:rPr>
@@ -493,6 +514,7 @@
           <w:between w:val="nil"/>
         </w:pBdr>
         <w:spacing w:after="40"/>
+        <w:jc w:val="both"/>
       </w:pPr>
       <w:r>
         <w:rPr>
@@ -515,6 +537,7 @@
           <w:between w:val="nil"/>
         </w:pBdr>
         <w:spacing w:after="40"/>
+        <w:jc w:val="both"/>
       </w:pPr>
       <w:r>
         <w:t>Evaluated AI-assisted workflows and intelligent interaction mechanisms for industrial training and field-support applications.</w:t>
@@ -522,30 +545,11 @@
     </w:p>
     <w:p>
       <w:pPr>
-        <w:tabs>
-          <w:tab w:val="right" w:pos="10065"/>
-        </w:tabs>
-        <w:spacing w:before="120" w:after="40"/>
-      </w:pPr>
-    </w:p>
-    <w:p>
-      <w:pPr>
-        <w:pBdr>
-          <w:top w:val="nil"/>
-          <w:left w:val="nil"/>
-          <w:bottom w:val="nil"/>
-          <w:right w:val="nil"/>
-          <w:between w:val="nil"/>
-        </w:pBdr>
-        <w:spacing w:after="40"/>
-      </w:pPr>
-    </w:p>
-    <w:p>
-      <w:pPr>
         <w:pBdr>
           <w:bottom w:val="single" w:sz="8" w:space="2" w:color="1A4F8A"/>
         </w:pBdr>
         <w:spacing w:before="180" w:after="60"/>
+        <w:jc w:val="both"/>
       </w:pPr>
       <w:r>
         <w:rPr>
@@ -561,10 +565,11 @@
     <w:p>
       <w:pPr>
         <w:tabs>
-          <w:tab w:val="right" w:pos="9360"/>
+          <w:tab w:val="right" w:pos="10065"/>
         </w:tabs>
         <w:spacing w:before="120" w:after="40"/>
         <w:ind w:left="284"/>
+        <w:jc w:val="both"/>
       </w:pPr>
       <w:r>
         <w:rPr>
@@ -589,57 +594,46 @@
           <w:color w:val="555555"/>
         </w:rPr>
         <w:tab/>
-        <w:t>Nov 2024 – Feb 2025</w:t>
-      </w:r>
-    </w:p>
-    <w:p>
-      <w:pPr>
-        <w:numPr>
-          <w:ilvl w:val="0"/>
-          <w:numId w:val="1"/>
-        </w:numPr>
-        <w:pBdr>
-          <w:top w:val="nil"/>
-          <w:left w:val="nil"/>
-          <w:bottom w:val="nil"/>
-          <w:right w:val="nil"/>
-          <w:between w:val="nil"/>
-        </w:pBdr>
-        <w:spacing w:after="40"/>
-      </w:pPr>
-      <w:r>
-        <w:rPr>
-          <w:color w:val="1A1A1A"/>
-        </w:rPr>
-        <w:t xml:space="preserve">Real-time object detection for visually impaired navigation; </w:t>
+        <w:t xml:space="preserve">Nov 2024 </w:t>
       </w:r>
       <w:r>
         <w:rPr>
           <w:i/>
           <w:iCs/>
-          <w:color w:val="1A1A1A"/>
-        </w:rPr>
-        <w:t>89%</w:t>
-      </w:r>
-      <w:r>
-        <w:rPr>
-          <w:color w:val="1A1A1A"/>
-        </w:rPr>
-        <w:t xml:space="preserve"> </w:t>
+          <w:color w:val="555555"/>
+        </w:rPr>
+        <w:t>-</w:t>
       </w:r>
       <w:r>
         <w:rPr>
           <w:i/>
           <w:iCs/>
-          <w:color w:val="1A1A1A"/>
-        </w:rPr>
-        <w:t>obstacle detection accuracy</w:t>
-      </w:r>
-      <w:r>
-        <w:rPr>
-          <w:color w:val="1A1A1A"/>
-        </w:rPr>
-        <w:t xml:space="preserve"> at </w:t>
+          <w:color w:val="555555"/>
+        </w:rPr>
+        <w:t xml:space="preserve"> Feb 2025</w:t>
+      </w:r>
+    </w:p>
+    <w:p>
+      <w:pPr>
+        <w:numPr>
+          <w:ilvl w:val="0"/>
+          <w:numId w:val="1"/>
+        </w:numPr>
+        <w:pBdr>
+          <w:top w:val="nil"/>
+          <w:left w:val="nil"/>
+          <w:bottom w:val="nil"/>
+          <w:right w:val="nil"/>
+          <w:between w:val="nil"/>
+        </w:pBdr>
+        <w:spacing w:after="40"/>
+        <w:jc w:val="both"/>
+      </w:pPr>
+      <w:r>
+        <w:rPr>
+          <w:color w:val="1A1A1A"/>
+        </w:rPr>
+        <w:t xml:space="preserve">Real-time object detection for visually impaired navigation; </w:t>
       </w:r>
       <w:r>
         <w:rPr>
@@ -647,6 +641,34 @@
           <w:iCs/>
           <w:color w:val="1A1A1A"/>
         </w:rPr>
+        <w:t>89%</w:t>
+      </w:r>
+      <w:r>
+        <w:rPr>
+          <w:color w:val="1A1A1A"/>
+        </w:rPr>
+        <w:t xml:space="preserve"> </w:t>
+      </w:r>
+      <w:r>
+        <w:rPr>
+          <w:i/>
+          <w:iCs/>
+          <w:color w:val="1A1A1A"/>
+        </w:rPr>
+        <w:t>obstacle detection accuracy</w:t>
+      </w:r>
+      <w:r>
+        <w:rPr>
+          <w:color w:val="1A1A1A"/>
+        </w:rPr>
+        <w:t xml:space="preserve"> at </w:t>
+      </w:r>
+      <w:r>
+        <w:rPr>
+          <w:i/>
+          <w:iCs/>
+          <w:color w:val="1A1A1A"/>
+        </w:rPr>
         <w:t>15fps</w:t>
       </w:r>
       <w:r>
@@ -670,6 +692,7 @@
           <w:between w:val="nil"/>
         </w:pBdr>
         <w:spacing w:after="40"/>
+        <w:jc w:val="both"/>
       </w:pPr>
       <w:r>
         <w:rPr>
@@ -704,6 +727,7 @@
           <w:between w:val="nil"/>
         </w:pBdr>
         <w:spacing w:after="40"/>
+        <w:jc w:val="both"/>
         <w:rPr>
           <w:color w:val="1A1A1A"/>
         </w:rPr>
@@ -717,36 +741,63 @@
     </w:p>
     <w:p>
       <w:pPr>
+        <w:tabs>
+          <w:tab w:val="right" w:pos="10065"/>
+        </w:tabs>
+        <w:spacing w:before="120" w:after="40"/>
+        <w:ind w:left="284"/>
+        <w:jc w:val="both"/>
+      </w:pPr>
+      <w:r>
+        <w:rPr>
+          <w:b/>
+          <w:bCs/>
+          <w:color w:val="1A1A1A"/>
+          <w:sz w:val="22"/>
+          <w:szCs w:val="22"/>
+        </w:rPr>
+        <w:t xml:space="preserve">KrishiMitra — Smart Farmer Assistance Platform </w:t>
+      </w:r>
+      <w:r>
+        <w:rPr>
+          <w:color w:val="555555"/>
+        </w:rPr>
+        <w:t xml:space="preserve">|  </w:t>
+      </w:r>
+      <w:r>
+        <w:rPr>
+          <w:i/>
+          <w:iCs/>
+          <w:color w:val="555555"/>
+        </w:rPr>
+        <w:tab/>
+        <w:t>Oct 2025 - Feb 2026</w:t>
+      </w:r>
+    </w:p>
+    <w:p>
+      <w:pPr>
+        <w:numPr>
+          <w:ilvl w:val="0"/>
+          <w:numId w:val="1"/>
+        </w:numPr>
+        <w:pBdr>
+          <w:top w:val="nil"/>
+          <w:left w:val="nil"/>
+          <w:bottom w:val="nil"/>
+          <w:right w:val="nil"/>
+          <w:between w:val="nil"/>
+        </w:pBdr>
         <w:tabs>
           <w:tab w:val="right" w:pos="9360"/>
         </w:tabs>
         <w:spacing w:before="120" w:after="40"/>
-        <w:ind w:left="284"/>
-      </w:pPr>
-      <w:r>
-        <w:rPr>
-          <w:b/>
-          <w:bCs/>
-          <w:color w:val="1A1A1A"/>
-          <w:sz w:val="22"/>
-          <w:szCs w:val="22"/>
-        </w:rPr>
-        <w:t xml:space="preserve">KrishiMitra — Smart Farmer Assistance Platform </w:t>
-      </w:r>
-      <w:r>
-        <w:rPr>
-          <w:color w:val="555555"/>
-        </w:rPr>
-        <w:t xml:space="preserve">|  </w:t>
-      </w:r>
-      <w:r>
-        <w:rPr>
-          <w:i/>
-          <w:iCs/>
-          <w:color w:val="555555"/>
-        </w:rPr>
-        <w:tab/>
-        <w:t>Oct 2025 - Feb 2026</w:t>
+        <w:jc w:val="both"/>
+      </w:pPr>
+      <w:r>
+        <w:rPr>
+          <w:color w:val="1A1A1A"/>
+        </w:rPr>
+        <w:t>Deployed AI crop advisory to 70+ farmers; 92% yield prediction accuracy</w:t>
       </w:r>
     </w:p>
     <w:p>
@@ -766,46 +817,23 @@
           <w:tab w:val="right" w:pos="9360"/>
         </w:tabs>
         <w:spacing w:before="120" w:after="40"/>
-      </w:pPr>
-      <w:r>
-        <w:rPr>
-          <w:color w:val="1A1A1A"/>
-        </w:rPr>
-        <w:t>Deployed AI crop advisory to 70+ farmers; 92% yield prediction accuracy</w:t>
-      </w:r>
-    </w:p>
-    <w:p>
-      <w:pPr>
-        <w:numPr>
-          <w:ilvl w:val="0"/>
-          <w:numId w:val="1"/>
-        </w:numPr>
-        <w:pBdr>
-          <w:top w:val="nil"/>
-          <w:left w:val="nil"/>
-          <w:bottom w:val="nil"/>
-          <w:right w:val="nil"/>
-          <w:between w:val="nil"/>
-        </w:pBdr>
+        <w:jc w:val="both"/>
+      </w:pPr>
+      <w:r>
+        <w:rPr>
+          <w:color w:val="1A1A1A"/>
+        </w:rPr>
+        <w:t>Tech: React/Node + RandomForest (15,000 training records, 12 engineered features)</w:t>
+      </w:r>
+    </w:p>
+    <w:p>
+      <w:pPr>
         <w:tabs>
-          <w:tab w:val="right" w:pos="9360"/>
-        </w:tabs>
-        <w:spacing w:before="120" w:after="40"/>
-      </w:pPr>
-      <w:r>
-        <w:rPr>
-          <w:color w:val="1A1A1A"/>
-        </w:rPr>
-        <w:t>Tech: React/Node + RandomForest (15,000 training records, 12 engineered features)</w:t>
-      </w:r>
-    </w:p>
-    <w:p>
-      <w:pPr>
-        <w:tabs>
-          <w:tab w:val="right" w:pos="9360"/>
+          <w:tab w:val="right" w:pos="10065"/>
         </w:tabs>
         <w:spacing w:before="120" w:after="40"/>
         <w:ind w:left="284"/>
+        <w:jc w:val="both"/>
       </w:pPr>
       <w:r>
         <w:rPr>
@@ -830,56 +858,74 @@
           <w:color w:val="555555"/>
         </w:rPr>
         <w:tab/>
-        <w:t>Apr 2025 – Jun 2025</w:t>
-      </w:r>
-    </w:p>
-    <w:p>
-      <w:pPr>
-        <w:numPr>
-          <w:ilvl w:val="0"/>
-          <w:numId w:val="1"/>
-        </w:numPr>
-        <w:pBdr>
-          <w:top w:val="nil"/>
-          <w:left w:val="nil"/>
-          <w:bottom w:val="nil"/>
-          <w:right w:val="nil"/>
-          <w:between w:val="nil"/>
-        </w:pBdr>
-        <w:spacing w:after="40"/>
-      </w:pPr>
-      <w:r>
-        <w:rPr>
-          <w:color w:val="1A1A1A"/>
-        </w:rPr>
-        <w:t>Conceptualized a bio-inspired autonomous cleaning system aimed at improving solar panel efficiency and reducing manual maintenance requirements</w:t>
-      </w:r>
-    </w:p>
-    <w:p>
-      <w:pPr>
-        <w:numPr>
-          <w:ilvl w:val="0"/>
-          <w:numId w:val="1"/>
-        </w:numPr>
-        <w:pBdr>
-          <w:top w:val="nil"/>
-          <w:left w:val="nil"/>
-          <w:bottom w:val="nil"/>
-          <w:right w:val="nil"/>
-          <w:between w:val="nil"/>
-        </w:pBdr>
-        <w:spacing w:after="40"/>
-      </w:pPr>
-      <w:r>
-        <w:rPr>
-          <w:color w:val="1A1A1A"/>
-        </w:rPr>
-        <w:t xml:space="preserve">Autonomous dust-removal prototype using microorganism-inspired approach; simulations showed </w:t>
+        <w:t xml:space="preserve">Apr 2025 </w:t>
       </w:r>
       <w:r>
         <w:rPr>
           <w:i/>
           <w:iCs/>
+          <w:color w:val="555555"/>
+        </w:rPr>
+        <w:t>-</w:t>
+      </w:r>
+      <w:r>
+        <w:rPr>
+          <w:i/>
+          <w:iCs/>
+          <w:color w:val="555555"/>
+        </w:rPr>
+        <w:t xml:space="preserve"> Jun 2025</w:t>
+      </w:r>
+    </w:p>
+    <w:p>
+      <w:pPr>
+        <w:numPr>
+          <w:ilvl w:val="0"/>
+          <w:numId w:val="1"/>
+        </w:numPr>
+        <w:pBdr>
+          <w:top w:val="nil"/>
+          <w:left w:val="nil"/>
+          <w:bottom w:val="nil"/>
+          <w:right w:val="nil"/>
+          <w:between w:val="nil"/>
+        </w:pBdr>
+        <w:spacing w:after="40"/>
+        <w:jc w:val="both"/>
+      </w:pPr>
+      <w:r>
+        <w:rPr>
+          <w:color w:val="1A1A1A"/>
+        </w:rPr>
+        <w:t>Conceptualized a bio-inspired autonomous cleaning system aimed at improving solar panel efficiency and reducing manual maintenance requirements</w:t>
+      </w:r>
+    </w:p>
+    <w:p>
+      <w:pPr>
+        <w:numPr>
+          <w:ilvl w:val="0"/>
+          <w:numId w:val="1"/>
+        </w:numPr>
+        <w:pBdr>
+          <w:top w:val="nil"/>
+          <w:left w:val="nil"/>
+          <w:bottom w:val="nil"/>
+          <w:right w:val="nil"/>
+          <w:between w:val="nil"/>
+        </w:pBdr>
+        <w:spacing w:after="40"/>
+        <w:jc w:val="both"/>
+      </w:pPr>
+      <w:r>
+        <w:rPr>
+          <w:color w:val="1A1A1A"/>
+        </w:rPr>
+        <w:t xml:space="preserve">Autonomous dust-removal prototype using microorganism-inspired approach; simulations showed </w:t>
+      </w:r>
+      <w:r>
+        <w:rPr>
+          <w:i/>
+          <w:iCs/>
           <w:color w:val="1A1A1A"/>
         </w:rPr>
         <w:t>84% efficiency gain vs manual cleaning</w:t>
@@ -899,12 +945,12 @@
           <w:between w:val="nil"/>
         </w:pBdr>
         <w:spacing w:after="40"/>
-      </w:pPr>
-      <w:r>
-        <w:rPr>
-          <w:color w:val="1A1A1A"/>
-        </w:rPr>
-        <w:lastRenderedPageBreak/>
+        <w:jc w:val="both"/>
+      </w:pPr>
+      <w:r>
+        <w:rPr>
+          <w:color w:val="1A1A1A"/>
+        </w:rPr>
         <w:t>Tech: React/Node dashboard for real-time monitoring; prototype stage with proof-of-concept validated</w:t>
       </w:r>
     </w:p>
@@ -922,6 +968,7 @@
           <w:between w:val="nil"/>
         </w:pBdr>
         <w:spacing w:after="40"/>
+        <w:jc w:val="both"/>
       </w:pPr>
       <w:r>
         <w:rPr>
@@ -933,10 +980,11 @@
     <w:p>
       <w:pPr>
         <w:tabs>
-          <w:tab w:val="right" w:pos="9360"/>
+          <w:tab w:val="right" w:pos="10065"/>
         </w:tabs>
         <w:spacing w:before="120" w:after="40"/>
         <w:ind w:left="284"/>
+        <w:jc w:val="both"/>
       </w:pPr>
       <w:r>
         <w:rPr>
@@ -946,6 +994,7 @@
           <w:sz w:val="22"/>
           <w:szCs w:val="22"/>
         </w:rPr>
+        <w:lastRenderedPageBreak/>
         <w:t>CyberQuezt — Interactive Cybersecurity Simulation Platform</w:t>
       </w:r>
       <w:r>
@@ -978,6 +1027,7 @@
           <w:between w:val="nil"/>
         </w:pBdr>
         <w:spacing w:after="40"/>
+        <w:jc w:val="both"/>
         <w:rPr>
           <w:i/>
           <w:iCs/>
@@ -1013,6 +1063,7 @@
           <w:between w:val="nil"/>
         </w:pBdr>
         <w:spacing w:after="40"/>
+        <w:jc w:val="both"/>
       </w:pPr>
       <w:r>
         <w:rPr>
@@ -1050,6 +1101,7 @@
           <w:between w:val="nil"/>
         </w:pBdr>
         <w:spacing w:after="40"/>
+        <w:jc w:val="both"/>
         <w:rPr>
           <w:color w:val="1A1A1A"/>
         </w:rPr>
@@ -1063,41 +1115,68 @@
     </w:p>
     <w:p>
       <w:pPr>
+        <w:tabs>
+          <w:tab w:val="right" w:pos="10065"/>
+        </w:tabs>
+        <w:spacing w:before="120" w:after="40"/>
+        <w:ind w:left="284"/>
+        <w:jc w:val="both"/>
+        <w:rPr>
+          <w:i/>
+          <w:iCs/>
+          <w:color w:val="555555"/>
+        </w:rPr>
+      </w:pPr>
+      <w:r>
+        <w:rPr>
+          <w:b/>
+          <w:bCs/>
+          <w:color w:val="1A1A1A"/>
+          <w:sz w:val="22"/>
+          <w:szCs w:val="22"/>
+        </w:rPr>
+        <w:t xml:space="preserve">JARVIS – AI Personal Assistant </w:t>
+      </w:r>
+      <w:r>
+        <w:rPr>
+          <w:color w:val="555555"/>
+        </w:rPr>
+        <w:t xml:space="preserve">|  </w:t>
+      </w:r>
+      <w:r>
+        <w:rPr>
+          <w:i/>
+          <w:iCs/>
+          <w:color w:val="555555"/>
+        </w:rPr>
+        <w:tab/>
+        <w:t xml:space="preserve"> May 2026 - Present</w:t>
+      </w:r>
+    </w:p>
+    <w:p>
+      <w:pPr>
+        <w:numPr>
+          <w:ilvl w:val="0"/>
+          <w:numId w:val="2"/>
+        </w:numPr>
+        <w:pBdr>
+          <w:top w:val="nil"/>
+          <w:left w:val="nil"/>
+          <w:bottom w:val="nil"/>
+          <w:right w:val="nil"/>
+          <w:between w:val="nil"/>
+        </w:pBdr>
         <w:tabs>
           <w:tab w:val="right" w:pos="9360"/>
         </w:tabs>
         <w:spacing w:before="120" w:after="40"/>
-        <w:ind w:left="284"/>
-        <w:rPr>
-          <w:i/>
-          <w:iCs/>
-          <w:color w:val="555555"/>
-        </w:rPr>
-      </w:pPr>
-      <w:r>
-        <w:rPr>
-          <w:b/>
-          <w:bCs/>
-          <w:color w:val="1A1A1A"/>
-          <w:sz w:val="22"/>
-          <w:szCs w:val="22"/>
-        </w:rPr>
-        <w:t xml:space="preserve">EcoTracker – Personal Carbon Footprint Tracker </w:t>
-      </w:r>
-      <w:r>
-        <w:rPr>
-          <w:color w:val="555555"/>
-        </w:rPr>
-        <w:t xml:space="preserve">|  </w:t>
-      </w:r>
-      <w:r>
-        <w:rPr>
-          <w:i/>
-          <w:iCs/>
-          <w:color w:val="555555"/>
-        </w:rPr>
-        <w:tab/>
-        <w:t>Nov 2025 - Mar 2026</w:t>
+        <w:jc w:val="both"/>
+      </w:pPr>
+      <w:r>
+        <w:rPr>
+          <w:color w:val="000000"/>
+        </w:rPr>
+        <w:t>Voice-controlled automation system with verbal command processing; integrates multiple services and converts personal systems into a fully automated worker that can deliver anything that it is asked</w:t>
       </w:r>
     </w:p>
     <w:p>
@@ -1117,41 +1196,80 @@
           <w:tab w:val="right" w:pos="9360"/>
         </w:tabs>
         <w:spacing w:before="120" w:after="40"/>
+        <w:jc w:val="both"/>
       </w:pPr>
       <w:r>
         <w:rPr>
           <w:color w:val="000000"/>
         </w:rPr>
-        <w:t xml:space="preserve">Web-based tool tracking daily carbon emissions from lifestyle activities; </w:t>
-      </w:r>
-      <w:r>
+        <w:t>Tech: NLP/LLMs; automates daily tasks and provides seamless experience</w:t>
+      </w:r>
+    </w:p>
+    <w:p>
+      <w:pPr>
+        <w:tabs>
+          <w:tab w:val="right" w:pos="10065"/>
+        </w:tabs>
+        <w:spacing w:before="120" w:after="40"/>
+        <w:ind w:left="284"/>
+        <w:jc w:val="both"/>
         <w:rPr>
           <w:i/>
           <w:iCs/>
-          <w:color w:val="000000"/>
-        </w:rPr>
-        <w:t>decreased carbon emmisions by 28% per capita</w:t>
-      </w:r>
-      <w:r>
-        <w:rPr>
-          <w:color w:val="000000"/>
-        </w:rPr>
-        <w:t xml:space="preserve"> and </w:t>
+          <w:color w:val="555555"/>
+        </w:rPr>
+      </w:pPr>
+      <w:r>
+        <w:rPr>
+          <w:b/>
+          <w:bCs/>
+          <w:color w:val="1A1A1A"/>
+          <w:sz w:val="22"/>
+          <w:szCs w:val="22"/>
+        </w:rPr>
+        <w:t xml:space="preserve">ARMS – </w:t>
+      </w:r>
+      <w:r>
+        <w:rPr>
+          <w:b/>
+          <w:bCs/>
+          <w:color w:val="1A1A1A"/>
+          <w:sz w:val="22"/>
+          <w:szCs w:val="22"/>
+        </w:rPr>
+        <w:t>AI Reconstruction of Memory System</w:t>
+      </w:r>
+      <w:r>
+        <w:rPr>
+          <w:b/>
+          <w:bCs/>
+          <w:color w:val="1A1A1A"/>
+          <w:sz w:val="22"/>
+          <w:szCs w:val="22"/>
+        </w:rPr>
+        <w:t xml:space="preserve"> </w:t>
+      </w:r>
+      <w:r>
+        <w:rPr>
+          <w:color w:val="555555"/>
+        </w:rPr>
+        <w:t xml:space="preserve">|  </w:t>
       </w:r>
       <w:r>
         <w:rPr>
           <w:i/>
           <w:iCs/>
-          <w:color w:val="000000"/>
-        </w:rPr>
-        <w:t>increased awareness by 82%</w:t>
-      </w:r>
-    </w:p>
-    <w:p>
-      <w:pPr>
-        <w:numPr>
-          <w:ilvl w:val="0"/>
-          <w:numId w:val="2"/>
+          <w:color w:val="555555"/>
+        </w:rPr>
+        <w:tab/>
+        <w:t>Apr 2026 - May 2026</w:t>
+      </w:r>
+    </w:p>
+    <w:p>
+      <w:pPr>
+        <w:numPr>
+          <w:ilvl w:val="0"/>
+          <w:numId w:val="3"/>
         </w:numPr>
         <w:pBdr>
           <w:top w:val="nil"/>
@@ -1164,204 +1282,33 @@
           <w:tab w:val="right" w:pos="9360"/>
         </w:tabs>
         <w:spacing w:before="120" w:after="40"/>
+        <w:jc w:val="both"/>
       </w:pPr>
       <w:r>
         <w:rPr>
           <w:color w:val="000000"/>
         </w:rPr>
-        <w:t>Tech: React/Node; helped users monitor and reduce environmental impact</w:t>
-      </w:r>
-    </w:p>
-    <w:p>
-      <w:pPr>
+        <w:t>Built an LLM-powered personal learning assistant that converts unstructured study materials into personalized summaries, quizzes, flashcards, and conversational tutoring experiences.</w:t>
+      </w:r>
+    </w:p>
+    <w:p>
+      <w:pPr>
+        <w:numPr>
+          <w:ilvl w:val="0"/>
+          <w:numId w:val="3"/>
+        </w:numPr>
+        <w:pBdr>
+          <w:top w:val="nil"/>
+          <w:left w:val="nil"/>
+          <w:bottom w:val="nil"/>
+          <w:right w:val="nil"/>
+          <w:between w:val="nil"/>
+        </w:pBdr>
         <w:tabs>
           <w:tab w:val="right" w:pos="9360"/>
         </w:tabs>
         <w:spacing w:before="120" w:after="40"/>
-        <w:ind w:left="284"/>
-        <w:rPr>
-          <w:i/>
-          <w:iCs/>
-          <w:color w:val="555555"/>
-        </w:rPr>
-      </w:pPr>
-      <w:r>
-        <w:rPr>
-          <w:b/>
-          <w:bCs/>
-          <w:color w:val="1A1A1A"/>
-          <w:sz w:val="22"/>
-          <w:szCs w:val="22"/>
-        </w:rPr>
-        <w:t xml:space="preserve">JARVIS – AI Personal Assistant </w:t>
-      </w:r>
-      <w:r>
-        <w:rPr>
-          <w:color w:val="555555"/>
-        </w:rPr>
-        <w:t xml:space="preserve">|  </w:t>
-      </w:r>
-      <w:r>
-        <w:rPr>
-          <w:i/>
-          <w:iCs/>
-          <w:color w:val="555555"/>
-        </w:rPr>
-        <w:tab/>
-        <w:t xml:space="preserve"> May 2026 - Present</w:t>
-      </w:r>
-    </w:p>
-    <w:p>
-      <w:pPr>
-        <w:numPr>
-          <w:ilvl w:val="0"/>
-          <w:numId w:val="2"/>
-        </w:numPr>
-        <w:pBdr>
-          <w:top w:val="nil"/>
-          <w:left w:val="nil"/>
-          <w:bottom w:val="nil"/>
-          <w:right w:val="nil"/>
-          <w:between w:val="nil"/>
-        </w:pBdr>
-        <w:tabs>
-          <w:tab w:val="right" w:pos="9360"/>
-        </w:tabs>
-        <w:spacing w:before="120" w:after="40"/>
-      </w:pPr>
-      <w:r>
-        <w:rPr>
-          <w:color w:val="000000"/>
-        </w:rPr>
-        <w:t>Voice-controlled automation system with verbal command processing; integrates multiple services and converts personal systems into a fully automated worker that can deliver anything that it is asked</w:t>
-      </w:r>
-    </w:p>
-    <w:p>
-      <w:pPr>
-        <w:numPr>
-          <w:ilvl w:val="0"/>
-          <w:numId w:val="2"/>
-        </w:numPr>
-        <w:pBdr>
-          <w:top w:val="nil"/>
-          <w:left w:val="nil"/>
-          <w:bottom w:val="nil"/>
-          <w:right w:val="nil"/>
-          <w:between w:val="nil"/>
-        </w:pBdr>
-        <w:tabs>
-          <w:tab w:val="right" w:pos="9360"/>
-        </w:tabs>
-        <w:spacing w:before="120" w:after="40"/>
-      </w:pPr>
-      <w:r>
-        <w:rPr>
-          <w:color w:val="000000"/>
-        </w:rPr>
-        <w:t>Tech: NLP/LLMs; automates daily tasks and provides seamless experience</w:t>
-      </w:r>
-    </w:p>
-    <w:p>
-      <w:pPr>
-        <w:tabs>
-          <w:tab w:val="right" w:pos="9360"/>
-        </w:tabs>
-        <w:spacing w:before="120" w:after="40"/>
-        <w:ind w:left="284"/>
-        <w:rPr>
-          <w:i/>
-          <w:iCs/>
-          <w:color w:val="555555"/>
-        </w:rPr>
-      </w:pPr>
-      <w:r>
-        <w:rPr>
-          <w:b/>
-          <w:bCs/>
-          <w:color w:val="1A1A1A"/>
-          <w:sz w:val="22"/>
-          <w:szCs w:val="22"/>
-        </w:rPr>
-        <w:t xml:space="preserve">ARMS – </w:t>
-      </w:r>
-      <w:r>
-        <w:rPr>
-          <w:b/>
-          <w:bCs/>
-          <w:color w:val="1A1A1A"/>
-          <w:sz w:val="22"/>
-          <w:szCs w:val="22"/>
-        </w:rPr>
-        <w:t>AI Reconstruction of Memory System</w:t>
-      </w:r>
-      <w:r>
-        <w:rPr>
-          <w:b/>
-          <w:bCs/>
-          <w:color w:val="1A1A1A"/>
-          <w:sz w:val="22"/>
-          <w:szCs w:val="22"/>
-        </w:rPr>
-        <w:t xml:space="preserve"> </w:t>
-      </w:r>
-      <w:r>
-        <w:rPr>
-          <w:color w:val="555555"/>
-        </w:rPr>
-        <w:t xml:space="preserve">|  </w:t>
-      </w:r>
-      <w:r>
-        <w:rPr>
-          <w:i/>
-          <w:iCs/>
-          <w:color w:val="555555"/>
-        </w:rPr>
-        <w:tab/>
-        <w:t>Apr 2026 - May 2026</w:t>
-      </w:r>
-    </w:p>
-    <w:p>
-      <w:pPr>
-        <w:numPr>
-          <w:ilvl w:val="0"/>
-          <w:numId w:val="3"/>
-        </w:numPr>
-        <w:pBdr>
-          <w:top w:val="nil"/>
-          <w:left w:val="nil"/>
-          <w:bottom w:val="nil"/>
-          <w:right w:val="nil"/>
-          <w:between w:val="nil"/>
-        </w:pBdr>
-        <w:tabs>
-          <w:tab w:val="right" w:pos="9360"/>
-        </w:tabs>
-        <w:spacing w:before="120" w:after="40"/>
-      </w:pPr>
-      <w:r>
-        <w:rPr>
-          <w:color w:val="000000"/>
-        </w:rPr>
-        <w:t>Built an LLM-powered personal learning assistant that converts unstructured study materials into personalized summaries, quizzes, flashcards, and conversational tutoring experiences.</w:t>
-      </w:r>
-    </w:p>
-    <w:p>
-      <w:pPr>
-        <w:numPr>
-          <w:ilvl w:val="0"/>
-          <w:numId w:val="3"/>
-        </w:numPr>
-        <w:pBdr>
-          <w:top w:val="nil"/>
-          <w:left w:val="nil"/>
-          <w:bottom w:val="nil"/>
-          <w:right w:val="nil"/>
-          <w:between w:val="nil"/>
-        </w:pBdr>
-        <w:tabs>
-          <w:tab w:val="right" w:pos="9360"/>
-        </w:tabs>
-        <w:spacing w:before="120" w:after="40"/>
+        <w:jc w:val="both"/>
       </w:pPr>
       <w:r>
         <w:t>Engineered an AI pipeline integrating document processing, semantic retrieval, and generative AI to create adaptive learning experiences and improve knowledge retention.</w:t>
@@ -1369,98 +1316,11 @@
     </w:p>
     <w:p>
       <w:pPr>
-        <w:tabs>
-          <w:tab w:val="right" w:pos="10065"/>
-        </w:tabs>
-        <w:spacing w:before="120" w:after="40"/>
-        <w:rPr>
-          <w:i/>
-          <w:iCs/>
-          <w:color w:val="555555"/>
-        </w:rPr>
-      </w:pPr>
-      <w:r>
-        <w:rPr>
-          <w:b/>
-          <w:bCs/>
-          <w:color w:val="1A1A1A"/>
-          <w:sz w:val="22"/>
-          <w:szCs w:val="22"/>
-        </w:rPr>
-        <w:t xml:space="preserve">AWG – Solar-Powered Atmospheric Water Generator </w:t>
-      </w:r>
-      <w:r>
-        <w:rPr>
-          <w:color w:val="555555"/>
-        </w:rPr>
-        <w:t xml:space="preserve">|  </w:t>
-      </w:r>
-      <w:r>
-        <w:rPr>
-          <w:i/>
-          <w:iCs/>
-          <w:color w:val="555555"/>
-        </w:rPr>
-        <w:tab/>
-        <w:t>Sept 2025</w:t>
-      </w:r>
-    </w:p>
-    <w:p>
-      <w:pPr>
-        <w:numPr>
-          <w:ilvl w:val="0"/>
-          <w:numId w:val="2"/>
-        </w:numPr>
-        <w:pBdr>
-          <w:top w:val="nil"/>
-          <w:left w:val="nil"/>
-          <w:bottom w:val="nil"/>
-          <w:right w:val="nil"/>
-          <w:between w:val="nil"/>
-        </w:pBdr>
-        <w:tabs>
-          <w:tab w:val="right" w:pos="9360"/>
-        </w:tabs>
-        <w:spacing w:before="120" w:after="40"/>
-      </w:pPr>
-      <w:r>
-        <w:rPr>
-          <w:color w:val="000000"/>
-        </w:rPr>
-        <w:t>Sustainable water generation prototype using solar energy and atmospheric humidity conversion</w:t>
-      </w:r>
-    </w:p>
-    <w:p>
-      <w:pPr>
-        <w:numPr>
-          <w:ilvl w:val="0"/>
-          <w:numId w:val="2"/>
-        </w:numPr>
-        <w:pBdr>
-          <w:top w:val="nil"/>
-          <w:left w:val="nil"/>
-          <w:bottom w:val="nil"/>
-          <w:right w:val="nil"/>
-          <w:between w:val="nil"/>
-        </w:pBdr>
-        <w:tabs>
-          <w:tab w:val="right" w:pos="9360"/>
-        </w:tabs>
-        <w:spacing w:before="120" w:after="40"/>
-      </w:pPr>
-      <w:r>
-        <w:rPr>
-          <w:color w:val="000000"/>
-        </w:rPr>
-        <w:t>Designed a solar-powered system addressing clean water scarcity through renewable energy</w:t>
-      </w:r>
-    </w:p>
-    <w:p>
-      <w:pPr>
         <w:pBdr>
           <w:bottom w:val="single" w:sz="8" w:space="2" w:color="1A4F8A"/>
         </w:pBdr>
         <w:spacing w:before="180" w:after="60"/>
+        <w:jc w:val="both"/>
       </w:pPr>
       <w:r>
         <w:rPr>
@@ -1476,6 +1336,7 @@
     <w:p>
       <w:pPr>
         <w:spacing w:after="50"/>
+        <w:jc w:val="both"/>
       </w:pPr>
       <w:r>
         <w:rPr>
@@ -1495,6 +1356,7 @@
     <w:p>
       <w:pPr>
         <w:spacing w:after="50"/>
+        <w:jc w:val="both"/>
       </w:pPr>
       <w:r>
         <w:rPr>
@@ -1514,6 +1376,7 @@
     <w:p>
       <w:pPr>
         <w:spacing w:after="50"/>
+        <w:jc w:val="both"/>
       </w:pPr>
       <w:r>
         <w:rPr>
@@ -1533,6 +1396,7 @@
     <w:p>
       <w:pPr>
         <w:spacing w:after="50"/>
+        <w:jc w:val="both"/>
         <w:rPr>
           <w:color w:val="1A1A1A"/>
         </w:rPr>
@@ -1549,12 +1413,19 @@
         <w:rPr>
           <w:color w:val="1A1A1A"/>
         </w:rPr>
-        <w:t>Git, Linux, VirtualBox, Cuckoo Sandbox, CATIA, SolidWorks, prompt engineering</w:t>
+        <w:t>Git, Linux, VirtualBox, Cuckoo Sandbox, CATIA, SolidWorks</w:t>
+      </w:r>
+      <w:r>
+        <w:rPr>
+          <w:color w:val="1A1A1A"/>
+        </w:rPr>
+        <w:t>, Docker.</w:t>
       </w:r>
     </w:p>
     <w:p>
       <w:pPr>
         <w:spacing w:after="50"/>
+        <w:jc w:val="both"/>
       </w:pPr>
       <w:r>
         <w:rPr>
@@ -1573,6 +1444,7 @@
           <w:bottom w:val="single" w:sz="8" w:space="2" w:color="1A4F8A"/>
         </w:pBdr>
         <w:spacing w:before="180" w:after="60"/>
+        <w:jc w:val="both"/>
       </w:pPr>
       <w:r>
         <w:rPr>
@@ -1600,6 +1472,7 @@
         </w:pBdr>
         <w:spacing w:after="40"/>
         <w:ind w:left="284"/>
+        <w:jc w:val="both"/>
       </w:pPr>
       <w:r>
         <w:rPr>
@@ -1623,6 +1496,7 @@
         </w:pBdr>
         <w:spacing w:after="40"/>
         <w:ind w:left="284"/>
+        <w:jc w:val="both"/>
       </w:pPr>
       <w:r>
         <w:rPr>
@@ -1646,6 +1520,7 @@
         </w:pBdr>
         <w:spacing w:after="40"/>
         <w:ind w:left="284"/>
+        <w:jc w:val="both"/>
       </w:pPr>
       <w:r>
         <w:rPr>
@@ -1681,6 +1556,7 @@
         </w:pBdr>
         <w:spacing w:after="40"/>
         <w:ind w:left="284"/>
+        <w:jc w:val="both"/>
       </w:pPr>
       <w:r>
         <w:rPr>
@@ -1716,6 +1592,7 @@
         </w:pBdr>
         <w:spacing w:after="40"/>
         <w:ind w:left="284"/>
+        <w:jc w:val="both"/>
       </w:pPr>
       <w:r>
         <w:rPr>
@@ -1739,6 +1616,7 @@
         </w:pBdr>
         <w:spacing w:after="40"/>
         <w:ind w:left="284"/>
+        <w:jc w:val="both"/>
       </w:pPr>
       <w:r>
         <w:rPr>
@@ -1762,12 +1640,19 @@
         </w:pBdr>
         <w:spacing w:after="40"/>
         <w:ind w:left="284"/>
-      </w:pPr>
-      <w:r>
-        <w:rPr>
-          <w:color w:val="1A1A1A"/>
-        </w:rPr>
-        <w:t>Coursera – ML Specialization by Andrew NG</w:t>
+        <w:jc w:val="both"/>
+      </w:pPr>
+      <w:r>
+        <w:rPr>
+          <w:color w:val="1A1A1A"/>
+        </w:rPr>
+        <w:t>Coursera – ML Specialization by Andrew N</w:t>
+      </w:r>
+      <w:r>
+        <w:rPr>
+          <w:color w:val="1A1A1A"/>
+        </w:rPr>
+        <w:t>g</w:t>
       </w:r>
     </w:p>
     <w:p>
@@ -1785,6 +1670,7 @@
         </w:pBdr>
         <w:spacing w:after="40"/>
         <w:ind w:left="284"/>
+        <w:jc w:val="both"/>
       </w:pPr>
       <w:r>
         <w:rPr>
@@ -1808,6 +1694,7 @@
         </w:pBdr>
         <w:spacing w:after="40"/>
         <w:ind w:left="284"/>
+        <w:jc w:val="both"/>
       </w:pPr>
       <w:r>
         <w:rPr>
@@ -1831,6 +1718,7 @@
         </w:pBdr>
         <w:spacing w:after="40"/>
         <w:ind w:left="284"/>
+        <w:jc w:val="both"/>
       </w:pPr>
       <w:r>
         <w:rPr>
@@ -1842,6 +1730,7 @@
     <w:p>
       <w:pPr>
         <w:spacing w:after="40"/>
+        <w:jc w:val="both"/>
       </w:pPr>
     </w:p>
     <w:sectPr>

</xml_diff>